<commit_message>
Updating manuscript with coauthor feedback
</commit_message>
<xml_diff>
--- a/03_results/tbl1_preview.docx
+++ b/03_results/tbl1_preview.docx
@@ -22,7 +22,7 @@
         <w:gridCol w:w="1143"/>
         <w:gridCol w:w="1413"/>
         <w:gridCol w:w="1233"/>
-        <w:gridCol w:w="1323"/>
+        <w:gridCol w:w="1398"/>
         <w:gridCol w:w="1233"/>
       </w:tblGrid>
       <w:tr>
@@ -131,7 +131,7 @@
                 <w:szCs w:val="18"/>
                 <w:color w:val="000000"/>
               </w:rPr>
-              <w:t xml:space="preserve">AIAN</w:t>
+              <w:t xml:space="preserve">NH AIAN</w:t>
             </w:r>
           </w:p>
         </w:tc>
@@ -183,7 +183,7 @@
                 <w:szCs w:val="18"/>
                 <w:color w:val="000000"/>
               </w:rPr>
-              <w:t xml:space="preserve">API</w:t>
+              <w:t xml:space="preserve">NH API</w:t>
             </w:r>
           </w:p>
         </w:tc>
@@ -235,7 +235,7 @@
                 <w:szCs w:val="18"/>
                 <w:color w:val="000000"/>
               </w:rPr>
-              <w:t xml:space="preserve">Black</w:t>
+              <w:t xml:space="preserve">NH Black</w:t>
             </w:r>
           </w:p>
         </w:tc>
@@ -339,7 +339,7 @@
                 <w:szCs w:val="18"/>
                 <w:color w:val="000000"/>
               </w:rPr>
-              <w:t xml:space="preserve">Multiracial</w:t>
+              <w:t xml:space="preserve">NH Multiracial</w:t>
             </w:r>
           </w:p>
         </w:tc>
@@ -391,7 +391,7 @@
                 <w:szCs w:val="18"/>
                 <w:color w:val="000000"/>
               </w:rPr>
-              <w:t xml:space="preserve">White</w:t>
+              <w:t xml:space="preserve">NH White</w:t>
             </w:r>
           </w:p>
         </w:tc>
@@ -8792,7 +8792,7 @@
                 <w:szCs w:val="18"/>
                 <w:color w:val="000000"/>
               </w:rPr>
-              <w:t xml:space="preserve">Abbreviations: AIAN = American Indian or Alaska Native; API = Asian or Pacific Islander.</w:t>
+              <w:t xml:space="preserve">Abbreviations: AIAN = American Indian or Alaska Native; API = Asian or Pacific Islander; NH = non-Hispanic.</w:t>
             </w:r>
           </w:p>
         </w:tc>

</xml_diff>